<commit_message>
Progreso ~40% documento 2.4 [ES]
El documento fue avanzado alrededor del porcentaje mencionado, dentro de las siguientes 24 horas recibirá otro commit para tener la versión completa.
</commit_message>
<xml_diff>
--- a/documentos por realizar/[ES] 2.4_GuiaEstudiante_Fase 2_DesarrolloProyecto APT.docx
+++ b/documentos por realizar/[ES] 2.4_GuiaEstudiante_Fase 2_DesarrolloProyecto APT.docx
@@ -1,11 +1,8 @@
 
 <file path=word/document.xml><?xml version="1.0" encoding="utf-8"?>
-<w:document xmlns:wpc="http://schemas.microsoft.com/office/word/2010/wordprocessingCanvas" xmlns:cx="http://schemas.microsoft.com/office/drawing/2014/chartex" xmlns:mc="http://schemas.openxmlformats.org/markup-compatibility/2006" xmlns:o="urn:schemas-microsoft-com:office:office" xmlns:r="http://schemas.openxmlformats.org/officeDocument/2006/relationships" xmlns:m="http://schemas.openxmlformats.org/officeDocument/2006/math" xmlns:v="urn:schemas-microsoft-com:vml" xmlns:wp14="http://schemas.microsoft.com/office/word/2010/wordprocessingDrawing" xmlns:wp="http://schemas.openxmlformats.org/drawingml/2006/wordprocessingDrawing" xmlns:w10="urn:schemas-microsoft-com:office:word" xmlns:w="http://schemas.openxmlformats.org/wordprocessingml/2006/main" xmlns:w14="http://schemas.microsoft.com/office/word/2010/wordml" xmlns:w15="http://schemas.microsoft.com/office/word/2012/wordml" xmlns:w16se="http://schemas.microsoft.com/office/word/2015/wordml/symex" xmlns:wpg="http://schemas.microsoft.com/office/word/2010/wordprocessingGroup" xmlns:wpi="http://schemas.microsoft.com/office/word/2010/wordprocessingInk" xmlns:wne="http://schemas.microsoft.com/office/word/2006/wordml" xmlns:wps="http://schemas.microsoft.com/office/word/2010/wordprocessingShape" mc:Ignorable="w14 w15 w16se wp14">
+<w:document xmlns:wpc="http://schemas.microsoft.com/office/word/2010/wordprocessingCanvas" xmlns:cx="http://schemas.microsoft.com/office/drawing/2014/chartex" xmlns:cx1="http://schemas.microsoft.com/office/drawing/2015/9/8/chartex" xmlns:cx2="http://schemas.microsoft.com/office/drawing/2015/10/21/chartex" xmlns:cx3="http://schemas.microsoft.com/office/drawing/2016/5/9/chartex" xmlns:cx4="http://schemas.microsoft.com/office/drawing/2016/5/10/chartex" xmlns:cx5="http://schemas.microsoft.com/office/drawing/2016/5/11/chartex" xmlns:cx6="http://schemas.microsoft.com/office/drawing/2016/5/12/chartex" xmlns:cx7="http://schemas.microsoft.com/office/drawing/2016/5/13/chartex" xmlns:cx8="http://schemas.microsoft.com/office/drawing/2016/5/14/chartex" xmlns:mc="http://schemas.openxmlformats.org/markup-compatibility/2006" xmlns:aink="http://schemas.microsoft.com/office/drawing/2016/ink" xmlns:am3d="http://schemas.microsoft.com/office/drawing/2017/model3d" xmlns:o="urn:schemas-microsoft-com:office:office" xmlns:r="http://schemas.openxmlformats.org/officeDocument/2006/relationships" xmlns:m="http://schemas.openxmlformats.org/officeDocument/2006/math" xmlns:v="urn:schemas-microsoft-com:vml" xmlns:wp14="http://schemas.microsoft.com/office/word/2010/wordprocessingDrawing" xmlns:wp="http://schemas.openxmlformats.org/drawingml/2006/wordprocessingDrawing" xmlns:w10="urn:schemas-microsoft-com:office:word" xmlns:w="http://schemas.openxmlformats.org/wordprocessingml/2006/main" xmlns:w14="http://schemas.microsoft.com/office/word/2010/wordml" xmlns:w15="http://schemas.microsoft.com/office/word/2012/wordml" xmlns:w16cex="http://schemas.microsoft.com/office/word/2018/wordml/cex" xmlns:w16cid="http://schemas.microsoft.com/office/word/2016/wordml/cid" xmlns:w16="http://schemas.microsoft.com/office/word/2018/wordml" xmlns:w16sdtdh="http://schemas.microsoft.com/office/word/2020/wordml/sdtdatahash" xmlns:w16se="http://schemas.microsoft.com/office/word/2015/wordml/symex" xmlns:wpg="http://schemas.microsoft.com/office/word/2010/wordprocessingGroup" xmlns:wpi="http://schemas.microsoft.com/office/word/2010/wordprocessingInk" xmlns:wne="http://schemas.microsoft.com/office/word/2006/wordml" xmlns:wps="http://schemas.microsoft.com/office/word/2010/wordprocessingShape" mc:Ignorable="w14 w15 w16se w16cid w16 w16cex w16sdtdh wp14">
   <w:body>
-    <w:p>
-      <w:bookmarkStart w:id="0" w:name="_GoBack"/>
-      <w:bookmarkEnd w:id="0"/>
-    </w:p>
+    <w:p/>
     <w:p>
       <w:pPr>
         <w:rPr>
@@ -417,17 +414,6 @@
         </w:rPr>
       </w:pPr>
     </w:p>
-    <w:p>
-      <w:pPr>
-        <w:rPr>
-          <w:rFonts w:cs="Calibri Light"/>
-          <w:color w:val="595959" w:themeColor="text1" w:themeTint="A6"/>
-          <w:sz w:val="24"/>
-          <w:szCs w:val="24"/>
-          <w:lang w:val="es-ES"/>
-        </w:rPr>
-      </w:pPr>
-    </w:p>
     <w:tbl>
       <w:tblPr>
         <w:tblStyle w:val="Tablaconcuadrcula"/>
@@ -542,18 +528,6 @@
         </w:tc>
       </w:tr>
     </w:tbl>
-    <w:p>
-      <w:pPr>
-        <w:spacing w:after="0" w:line="240" w:lineRule="auto"/>
-        <w:rPr>
-          <w:rFonts w:cs="Calibri Light"/>
-          <w:color w:val="595959" w:themeColor="text1" w:themeTint="A6"/>
-          <w:sz w:val="24"/>
-          <w:szCs w:val="24"/>
-          <w:lang w:val="es-ES"/>
-        </w:rPr>
-      </w:pPr>
-    </w:p>
     <w:p>
       <w:pPr>
         <w:spacing w:after="0" w:line="240" w:lineRule="auto"/>
@@ -646,141 +620,7 @@
                 <w:szCs w:val="20"/>
                 <w:lang w:eastAsia="es-CL"/>
               </w:rPr>
-              <w:t xml:space="preserve">En esta </w:t>
-            </w:r>
-            <w:r>
-              <w:rPr>
-                <w:rFonts w:ascii="Calibri" w:hAnsi="Calibri" w:cs="Arial"/>
-                <w:i/>
-                <w:color w:val="548DD4"/>
-                <w:sz w:val="20"/>
-                <w:szCs w:val="20"/>
-                <w:lang w:eastAsia="es-CL"/>
-              </w:rPr>
-              <w:t>sección</w:t>
-            </w:r>
-            <w:r>
-              <w:rPr>
-                <w:rFonts w:ascii="Calibri" w:hAnsi="Calibri" w:cs="Arial"/>
-                <w:i/>
-                <w:color w:val="548DD4"/>
-                <w:sz w:val="20"/>
-                <w:szCs w:val="20"/>
-                <w:lang w:eastAsia="es-CL"/>
-              </w:rPr>
-              <w:t xml:space="preserve"> deberá</w:t>
-            </w:r>
-            <w:r>
-              <w:rPr>
-                <w:rFonts w:ascii="Calibri" w:hAnsi="Calibri" w:cs="Arial"/>
-                <w:i/>
-                <w:color w:val="548DD4"/>
-                <w:sz w:val="20"/>
-                <w:szCs w:val="20"/>
-                <w:lang w:eastAsia="es-CL"/>
-              </w:rPr>
-              <w:t>s</w:t>
-            </w:r>
-            <w:r>
-              <w:rPr>
-                <w:rFonts w:ascii="Calibri" w:hAnsi="Calibri" w:cs="Arial"/>
-                <w:i/>
-                <w:color w:val="548DD4"/>
-                <w:sz w:val="20"/>
-                <w:szCs w:val="20"/>
-                <w:lang w:eastAsia="es-CL"/>
-              </w:rPr>
-              <w:t xml:space="preserve"> </w:t>
-            </w:r>
-            <w:r>
-              <w:rPr>
-                <w:rFonts w:ascii="Calibri" w:hAnsi="Calibri" w:cs="Arial"/>
-                <w:i/>
-                <w:color w:val="548DD4"/>
-                <w:sz w:val="20"/>
-                <w:szCs w:val="20"/>
-                <w:lang w:eastAsia="es-CL"/>
-              </w:rPr>
-              <w:t xml:space="preserve">realizar un resumen de los avances que has realizado en tu proyecto APT. </w:t>
-            </w:r>
-            <w:r>
-              <w:rPr>
-                <w:rFonts w:ascii="Calibri" w:hAnsi="Calibri" w:cs="Arial"/>
-                <w:i/>
-                <w:color w:val="548DD4"/>
-                <w:sz w:val="20"/>
-                <w:szCs w:val="20"/>
-                <w:lang w:eastAsia="es-CL"/>
-              </w:rPr>
-              <w:t xml:space="preserve">Relata </w:t>
-            </w:r>
-            <w:r>
-              <w:rPr>
-                <w:rFonts w:ascii="Calibri" w:hAnsi="Calibri" w:cs="Arial"/>
-                <w:i/>
-                <w:color w:val="548DD4"/>
-                <w:sz w:val="20"/>
-                <w:szCs w:val="20"/>
-                <w:lang w:eastAsia="es-CL"/>
-              </w:rPr>
-              <w:t xml:space="preserve">brevemente </w:t>
-            </w:r>
-            <w:r>
-              <w:rPr>
-                <w:rFonts w:ascii="Calibri" w:hAnsi="Calibri" w:cs="Arial"/>
-                <w:i/>
-                <w:color w:val="548DD4"/>
-                <w:sz w:val="20"/>
-                <w:szCs w:val="20"/>
-                <w:lang w:eastAsia="es-CL"/>
-              </w:rPr>
-              <w:t xml:space="preserve">qué </w:t>
-            </w:r>
-            <w:r>
-              <w:rPr>
-                <w:rFonts w:ascii="Calibri" w:hAnsi="Calibri" w:cs="Arial"/>
-                <w:i/>
-                <w:color w:val="548DD4"/>
-                <w:sz w:val="20"/>
-                <w:szCs w:val="20"/>
-                <w:lang w:eastAsia="es-CL"/>
-              </w:rPr>
-              <w:t xml:space="preserve">actividades </w:t>
-            </w:r>
-            <w:r>
-              <w:rPr>
-                <w:rFonts w:ascii="Calibri" w:hAnsi="Calibri" w:cs="Arial"/>
-                <w:i/>
-                <w:color w:val="548DD4"/>
-                <w:sz w:val="20"/>
-                <w:szCs w:val="20"/>
-                <w:lang w:eastAsia="es-CL"/>
-              </w:rPr>
-              <w:t>del proyecto has llevado a cabo y qué objetivos específicos has cumplido hasta el minuto y de qué manera.</w:t>
-            </w:r>
-          </w:p>
-          <w:p>
-            <w:pPr>
-              <w:jc w:val="both"/>
-              <w:rPr>
-                <w:rFonts w:ascii="Calibri" w:hAnsi="Calibri" w:cs="Arial"/>
-                <w:i/>
-                <w:color w:val="548DD4"/>
-                <w:sz w:val="20"/>
-                <w:szCs w:val="20"/>
-                <w:lang w:eastAsia="es-CL"/>
-              </w:rPr>
-            </w:pPr>
-            <w:r>
-              <w:rPr>
-                <w:rFonts w:ascii="Calibri" w:hAnsi="Calibri" w:cs="Arial"/>
-                <w:i/>
-                <w:color w:val="548DD4"/>
-                <w:sz w:val="20"/>
-                <w:szCs w:val="20"/>
-                <w:lang w:eastAsia="es-CL"/>
-              </w:rPr>
-              <w:t>En caso que hayas realizado ajustes a los objetivos o metodología, debes incluir dichos apartados nuevamente en este informe, señalando cuáles son dichos ajustes.</w:t>
+              <w:t>Los avances hasta inicios de la semana 7 ha sido tener el proyecto organizado y planificado frente hacia quién esta dirigido, que contendrá el proyecto, y detalles sobre sus funciones como registros de progresos, inicios de sesiones, etc. En esta misma semana se terminó el modelamiento de datos de la plataforma para el taller independiente.</w:t>
             </w:r>
           </w:p>
         </w:tc>
@@ -831,13 +671,40 @@
             <w:r>
               <w:rPr>
                 <w:rFonts w:ascii="Calibri" w:hAnsi="Calibri" w:cs="Arial"/>
-                <w:i/>
-                <w:color w:val="548DD4"/>
-                <w:sz w:val="20"/>
-                <w:szCs w:val="20"/>
-                <w:lang w:eastAsia="es-CL"/>
-              </w:rPr>
-              <w:t>Opcional en caso de ajuste</w:t>
+                <w:b/>
+                <w:i/>
+                <w:color w:val="548DD4"/>
+                <w:sz w:val="20"/>
+                <w:szCs w:val="20"/>
+                <w:lang w:eastAsia="es-CL"/>
+              </w:rPr>
+              <w:t>Realizar el modelamiento de datos previsto para la semana 7</w:t>
+            </w:r>
+          </w:p>
+          <w:p>
+            <w:pPr>
+              <w:jc w:val="both"/>
+              <w:rPr>
+                <w:rFonts w:ascii="Calibri" w:hAnsi="Calibri" w:cs="Arial"/>
+                <w:b/>
+                <w:i/>
+                <w:color w:val="548DD4"/>
+                <w:sz w:val="20"/>
+                <w:szCs w:val="20"/>
+                <w:lang w:eastAsia="es-CL"/>
+              </w:rPr>
+            </w:pPr>
+            <w:r>
+              <w:rPr>
+                <w:rFonts w:ascii="Calibri" w:hAnsi="Calibri" w:cs="Arial"/>
+                <w:b/>
+                <w:i/>
+                <w:color w:val="548DD4"/>
+                <w:sz w:val="20"/>
+                <w:szCs w:val="20"/>
+                <w:lang w:eastAsia="es-CL"/>
+              </w:rPr>
+              <w:t>Realizar un avance de nivel medio del módulo de asistencia y pruebas de la misma frente a su función aplicada en la plataforma. Por lo que en esta misma semana debería de empezar armar la página que se entregará en el cierre del semestre.</w:t>
             </w:r>
           </w:p>
         </w:tc>
@@ -893,7 +760,7 @@
                 <w:szCs w:val="20"/>
                 <w:lang w:eastAsia="es-CL"/>
               </w:rPr>
-              <w:t>Opcional en caso de ajuste</w:t>
+              <w:t xml:space="preserve">                                                           -----------</w:t>
             </w:r>
           </w:p>
         </w:tc>
@@ -933,309 +800,141 @@
               <w:jc w:val="both"/>
               <w:rPr>
                 <w:rFonts w:ascii="Calibri" w:hAnsi="Calibri" w:cs="Arial"/>
-                <w:i/>
-                <w:color w:val="548DD4"/>
-                <w:sz w:val="20"/>
-                <w:szCs w:val="20"/>
-                <w:lang w:eastAsia="es-CL"/>
-              </w:rPr>
-            </w:pPr>
-            <w:r>
-              <w:rPr>
-                <w:rFonts w:ascii="Calibri" w:hAnsi="Calibri" w:cs="Arial"/>
-                <w:i/>
-                <w:color w:val="548DD4"/>
-                <w:sz w:val="20"/>
-                <w:szCs w:val="20"/>
-                <w:lang w:eastAsia="es-CL"/>
-              </w:rPr>
-              <w:t>Describe la</w:t>
-            </w:r>
-            <w:r>
-              <w:rPr>
-                <w:rFonts w:ascii="Calibri" w:hAnsi="Calibri" w:cs="Arial"/>
-                <w:i/>
-                <w:color w:val="548DD4"/>
-                <w:sz w:val="20"/>
-                <w:szCs w:val="20"/>
-                <w:lang w:eastAsia="es-CL"/>
-              </w:rPr>
-              <w:t>(</w:t>
-            </w:r>
-            <w:r>
-              <w:rPr>
-                <w:rFonts w:ascii="Calibri" w:hAnsi="Calibri" w:cs="Arial"/>
-                <w:i/>
-                <w:color w:val="548DD4"/>
-                <w:sz w:val="20"/>
-                <w:szCs w:val="20"/>
-                <w:lang w:eastAsia="es-CL"/>
-              </w:rPr>
-              <w:t>s</w:t>
-            </w:r>
-            <w:r>
-              <w:rPr>
-                <w:rFonts w:ascii="Calibri" w:hAnsi="Calibri" w:cs="Arial"/>
-                <w:i/>
-                <w:color w:val="548DD4"/>
-                <w:sz w:val="20"/>
-                <w:szCs w:val="20"/>
-                <w:lang w:eastAsia="es-CL"/>
-              </w:rPr>
-              <w:t>)</w:t>
-            </w:r>
-            <w:r>
-              <w:rPr>
-                <w:rFonts w:ascii="Calibri" w:hAnsi="Calibri" w:cs="Arial"/>
-                <w:i/>
-                <w:color w:val="548DD4"/>
-                <w:sz w:val="20"/>
-                <w:szCs w:val="20"/>
-                <w:lang w:eastAsia="es-CL"/>
-              </w:rPr>
-              <w:t xml:space="preserve"> evidencia</w:t>
-            </w:r>
-            <w:r>
-              <w:rPr>
-                <w:rFonts w:ascii="Calibri" w:hAnsi="Calibri" w:cs="Arial"/>
-                <w:i/>
-                <w:color w:val="548DD4"/>
-                <w:sz w:val="20"/>
-                <w:szCs w:val="20"/>
-                <w:lang w:eastAsia="es-CL"/>
-              </w:rPr>
-              <w:t>(</w:t>
-            </w:r>
-            <w:r>
-              <w:rPr>
-                <w:rFonts w:ascii="Calibri" w:hAnsi="Calibri" w:cs="Arial"/>
-                <w:i/>
-                <w:color w:val="548DD4"/>
-                <w:sz w:val="20"/>
-                <w:szCs w:val="20"/>
-                <w:lang w:eastAsia="es-CL"/>
-              </w:rPr>
-              <w:t>s</w:t>
-            </w:r>
-            <w:r>
-              <w:rPr>
-                <w:rFonts w:ascii="Calibri" w:hAnsi="Calibri" w:cs="Arial"/>
-                <w:i/>
-                <w:color w:val="548DD4"/>
-                <w:sz w:val="20"/>
-                <w:szCs w:val="20"/>
-                <w:lang w:eastAsia="es-CL"/>
-              </w:rPr>
-              <w:t>)</w:t>
-            </w:r>
-            <w:r>
-              <w:rPr>
-                <w:rFonts w:ascii="Calibri" w:hAnsi="Calibri" w:cs="Arial"/>
-                <w:i/>
-                <w:color w:val="548DD4"/>
-                <w:sz w:val="20"/>
-                <w:szCs w:val="20"/>
-                <w:lang w:eastAsia="es-CL"/>
-              </w:rPr>
-              <w:t xml:space="preserve"> que </w:t>
-            </w:r>
-            <w:r>
-              <w:rPr>
-                <w:rFonts w:ascii="Calibri" w:hAnsi="Calibri" w:cs="Arial"/>
-                <w:i/>
-                <w:color w:val="548DD4"/>
-                <w:sz w:val="20"/>
-                <w:szCs w:val="20"/>
-                <w:lang w:eastAsia="es-CL"/>
-              </w:rPr>
-              <w:t xml:space="preserve">presentarás en este informe de avance y justifica </w:t>
-            </w:r>
-            <w:r>
-              <w:rPr>
-                <w:rFonts w:ascii="Calibri" w:hAnsi="Calibri" w:cs="Arial"/>
-                <w:i/>
-                <w:color w:val="548DD4"/>
-                <w:sz w:val="20"/>
-                <w:szCs w:val="20"/>
-                <w:lang w:eastAsia="es-CL"/>
-              </w:rPr>
-              <w:t xml:space="preserve">de qué manera </w:t>
-            </w:r>
-            <w:r>
-              <w:rPr>
-                <w:rFonts w:ascii="Calibri" w:hAnsi="Calibri" w:cs="Arial"/>
-                <w:i/>
-                <w:color w:val="548DD4"/>
-                <w:sz w:val="20"/>
-                <w:szCs w:val="20"/>
-                <w:lang w:eastAsia="es-CL"/>
-              </w:rPr>
-              <w:t>esta</w:t>
-            </w:r>
-            <w:r>
-              <w:rPr>
-                <w:rFonts w:ascii="Calibri" w:hAnsi="Calibri" w:cs="Arial"/>
-                <w:i/>
-                <w:color w:val="548DD4"/>
-                <w:sz w:val="20"/>
-                <w:szCs w:val="20"/>
-                <w:lang w:eastAsia="es-CL"/>
-              </w:rPr>
-              <w:t>(</w:t>
-            </w:r>
-            <w:r>
-              <w:rPr>
-                <w:rFonts w:ascii="Calibri" w:hAnsi="Calibri" w:cs="Arial"/>
-                <w:i/>
-                <w:color w:val="548DD4"/>
-                <w:sz w:val="20"/>
-                <w:szCs w:val="20"/>
-                <w:lang w:eastAsia="es-CL"/>
-              </w:rPr>
-              <w:t>s</w:t>
-            </w:r>
-            <w:r>
-              <w:rPr>
-                <w:rFonts w:ascii="Calibri" w:hAnsi="Calibri" w:cs="Arial"/>
-                <w:i/>
-                <w:color w:val="548DD4"/>
-                <w:sz w:val="20"/>
-                <w:szCs w:val="20"/>
-                <w:lang w:eastAsia="es-CL"/>
-              </w:rPr>
-              <w:t>)</w:t>
-            </w:r>
-            <w:r>
-              <w:rPr>
-                <w:rFonts w:ascii="Calibri" w:hAnsi="Calibri" w:cs="Arial"/>
-                <w:i/>
-                <w:color w:val="548DD4"/>
-                <w:sz w:val="20"/>
-                <w:szCs w:val="20"/>
-                <w:lang w:eastAsia="es-CL"/>
-              </w:rPr>
-              <w:t xml:space="preserve"> evidencia</w:t>
-            </w:r>
-            <w:r>
-              <w:rPr>
-                <w:rFonts w:ascii="Calibri" w:hAnsi="Calibri" w:cs="Arial"/>
-                <w:i/>
-                <w:color w:val="548DD4"/>
-                <w:sz w:val="20"/>
-                <w:szCs w:val="20"/>
-                <w:lang w:eastAsia="es-CL"/>
-              </w:rPr>
-              <w:t>(</w:t>
-            </w:r>
-            <w:r>
-              <w:rPr>
-                <w:rFonts w:ascii="Calibri" w:hAnsi="Calibri" w:cs="Arial"/>
-                <w:i/>
-                <w:color w:val="548DD4"/>
-                <w:sz w:val="20"/>
-                <w:szCs w:val="20"/>
-                <w:lang w:eastAsia="es-CL"/>
-              </w:rPr>
-              <w:t>s</w:t>
-            </w:r>
-            <w:r>
-              <w:rPr>
-                <w:rFonts w:ascii="Calibri" w:hAnsi="Calibri" w:cs="Arial"/>
-                <w:i/>
-                <w:color w:val="548DD4"/>
-                <w:sz w:val="20"/>
-                <w:szCs w:val="20"/>
-                <w:lang w:eastAsia="es-CL"/>
-              </w:rPr>
-              <w:t>)</w:t>
-            </w:r>
-            <w:r>
-              <w:rPr>
-                <w:rFonts w:ascii="Calibri" w:hAnsi="Calibri" w:cs="Arial"/>
-                <w:i/>
-                <w:color w:val="548DD4"/>
-                <w:sz w:val="20"/>
-                <w:szCs w:val="20"/>
-                <w:lang w:eastAsia="es-CL"/>
-              </w:rPr>
-              <w:t xml:space="preserve"> </w:t>
-            </w:r>
-            <w:r>
-              <w:rPr>
-                <w:rFonts w:ascii="Calibri" w:hAnsi="Calibri" w:cs="Arial"/>
-                <w:i/>
-                <w:color w:val="548DD4"/>
-                <w:sz w:val="20"/>
-                <w:szCs w:val="20"/>
-                <w:lang w:eastAsia="es-CL"/>
-              </w:rPr>
-              <w:t xml:space="preserve">permite(n) </w:t>
-            </w:r>
-            <w:r>
-              <w:rPr>
-                <w:rFonts w:ascii="Calibri" w:hAnsi="Calibri" w:cs="Arial"/>
-                <w:i/>
-                <w:color w:val="548DD4"/>
-                <w:sz w:val="20"/>
-                <w:szCs w:val="20"/>
-                <w:lang w:eastAsia="es-CL"/>
-              </w:rPr>
-              <w:t>da</w:t>
-            </w:r>
-            <w:r>
-              <w:rPr>
-                <w:rFonts w:ascii="Calibri" w:hAnsi="Calibri" w:cs="Arial"/>
-                <w:i/>
-                <w:color w:val="548DD4"/>
-                <w:sz w:val="20"/>
-                <w:szCs w:val="20"/>
-                <w:lang w:eastAsia="es-CL"/>
-              </w:rPr>
-              <w:t>r</w:t>
-            </w:r>
-            <w:r>
-              <w:rPr>
-                <w:rFonts w:ascii="Calibri" w:hAnsi="Calibri" w:cs="Arial"/>
-                <w:i/>
-                <w:color w:val="548DD4"/>
-                <w:sz w:val="20"/>
-                <w:szCs w:val="20"/>
-                <w:lang w:eastAsia="es-CL"/>
-              </w:rPr>
-              <w:t xml:space="preserve"> cuenta del </w:t>
-            </w:r>
-            <w:r>
-              <w:rPr>
-                <w:rFonts w:ascii="Calibri" w:hAnsi="Calibri" w:cs="Arial"/>
-                <w:i/>
-                <w:color w:val="548DD4"/>
-                <w:sz w:val="20"/>
-                <w:szCs w:val="20"/>
-                <w:lang w:eastAsia="es-CL"/>
-              </w:rPr>
-              <w:t>desarrollo</w:t>
-            </w:r>
-            <w:r>
-              <w:rPr>
-                <w:rFonts w:ascii="Calibri" w:hAnsi="Calibri" w:cs="Arial"/>
-                <w:i/>
-                <w:color w:val="548DD4"/>
-                <w:sz w:val="20"/>
-                <w:szCs w:val="20"/>
-                <w:lang w:eastAsia="es-CL"/>
-              </w:rPr>
-              <w:t xml:space="preserve"> </w:t>
-            </w:r>
-            <w:r>
-              <w:rPr>
-                <w:rFonts w:ascii="Calibri" w:hAnsi="Calibri" w:cs="Arial"/>
-                <w:i/>
-                <w:color w:val="548DD4"/>
-                <w:sz w:val="20"/>
-                <w:szCs w:val="20"/>
-                <w:lang w:eastAsia="es-CL"/>
-              </w:rPr>
-              <w:t>del proyecto.</w:t>
+                <w:b/>
+                <w:i/>
+                <w:color w:val="548DD4"/>
+                <w:sz w:val="20"/>
+                <w:szCs w:val="20"/>
+                <w:lang w:eastAsia="es-CL"/>
+              </w:rPr>
+            </w:pPr>
+            <w:r>
+              <w:rPr>
+                <w:rFonts w:ascii="Calibri" w:hAnsi="Calibri" w:cs="Arial"/>
+                <w:b/>
+                <w:i/>
+                <w:color w:val="548DD4"/>
+                <w:sz w:val="20"/>
+                <w:szCs w:val="20"/>
+                <w:lang w:eastAsia="es-CL"/>
+              </w:rPr>
+              <w:t xml:space="preserve">Las evidencias son los </w:t>
+            </w:r>
+            <w:proofErr w:type="spellStart"/>
+            <w:r>
+              <w:rPr>
+                <w:rFonts w:ascii="Calibri" w:hAnsi="Calibri" w:cs="Arial"/>
+                <w:b/>
+                <w:i/>
+                <w:color w:val="548DD4"/>
+                <w:sz w:val="20"/>
+                <w:szCs w:val="20"/>
+                <w:lang w:eastAsia="es-CL"/>
+              </w:rPr>
+              <w:t>commits</w:t>
+            </w:r>
+            <w:proofErr w:type="spellEnd"/>
+            <w:r>
+              <w:rPr>
+                <w:rFonts w:ascii="Calibri" w:hAnsi="Calibri" w:cs="Arial"/>
+                <w:b/>
+                <w:i/>
+                <w:color w:val="548DD4"/>
+                <w:sz w:val="20"/>
+                <w:szCs w:val="20"/>
+                <w:lang w:eastAsia="es-CL"/>
+              </w:rPr>
+              <w:t xml:space="preserve"> ejecutados en el repositorio de </w:t>
+            </w:r>
+            <w:proofErr w:type="spellStart"/>
+            <w:r>
+              <w:rPr>
+                <w:rFonts w:ascii="Calibri" w:hAnsi="Calibri" w:cs="Arial"/>
+                <w:b/>
+                <w:i/>
+                <w:color w:val="548DD4"/>
+                <w:sz w:val="20"/>
+                <w:szCs w:val="20"/>
+                <w:lang w:eastAsia="es-CL"/>
+              </w:rPr>
+              <w:t>Github</w:t>
+            </w:r>
+            <w:proofErr w:type="spellEnd"/>
+            <w:r>
+              <w:rPr>
+                <w:rFonts w:ascii="Calibri" w:hAnsi="Calibri" w:cs="Arial"/>
+                <w:b/>
+                <w:i/>
+                <w:color w:val="548DD4"/>
+                <w:sz w:val="20"/>
+                <w:szCs w:val="20"/>
+                <w:lang w:eastAsia="es-CL"/>
+              </w:rPr>
+              <w:t xml:space="preserve"> con sus fechas correspondientes, ajustes de archivos, reemplazo de plantillas con archivos completos a lo largo de estas 7 semanas. Resguarde la calidad del proyecto revisando de forma habitual la carta Gantt para tener un margen sobre si frente a lo avanzado, estaba atrasado o iba bien de tiempo. </w:t>
+            </w:r>
+            <w:r>
+              <w:rPr>
+                <w:rFonts w:ascii="Calibri" w:hAnsi="Calibri" w:cs="Arial"/>
+                <w:b/>
+                <w:i/>
+                <w:color w:val="548DD4"/>
+                <w:sz w:val="20"/>
+                <w:szCs w:val="20"/>
+                <w:lang w:eastAsia="es-CL"/>
+              </w:rPr>
+              <w:t xml:space="preserve">Las evidencias de lo mencionado sobre los </w:t>
+            </w:r>
+            <w:proofErr w:type="spellStart"/>
+            <w:r>
+              <w:rPr>
+                <w:rFonts w:ascii="Calibri" w:hAnsi="Calibri" w:cs="Arial"/>
+                <w:b/>
+                <w:i/>
+                <w:color w:val="548DD4"/>
+                <w:sz w:val="20"/>
+                <w:szCs w:val="20"/>
+                <w:lang w:eastAsia="es-CL"/>
+              </w:rPr>
+              <w:t>commits</w:t>
+            </w:r>
+            <w:proofErr w:type="spellEnd"/>
+            <w:r>
+              <w:rPr>
+                <w:rFonts w:ascii="Calibri" w:hAnsi="Calibri" w:cs="Arial"/>
+                <w:b/>
+                <w:i/>
+                <w:color w:val="548DD4"/>
+                <w:sz w:val="20"/>
+                <w:szCs w:val="20"/>
+                <w:lang w:eastAsia="es-CL"/>
+              </w:rPr>
+              <w:t xml:space="preserve"> con sus fechas correspondientes. Estará un formato PDF con todas estas acciones hechas lo que llevamos de </w:t>
+            </w:r>
+            <w:proofErr w:type="spellStart"/>
+            <w:r>
+              <w:rPr>
+                <w:rFonts w:ascii="Calibri" w:hAnsi="Calibri" w:cs="Arial"/>
+                <w:b/>
+                <w:i/>
+                <w:color w:val="548DD4"/>
+                <w:sz w:val="20"/>
+                <w:szCs w:val="20"/>
+                <w:lang w:eastAsia="es-CL"/>
+              </w:rPr>
+              <w:t>de</w:t>
+            </w:r>
+            <w:proofErr w:type="spellEnd"/>
+            <w:r>
+              <w:rPr>
+                <w:rFonts w:ascii="Calibri" w:hAnsi="Calibri" w:cs="Arial"/>
+                <w:b/>
+                <w:i/>
+                <w:color w:val="548DD4"/>
+                <w:sz w:val="20"/>
+                <w:szCs w:val="20"/>
+                <w:lang w:eastAsia="es-CL"/>
+              </w:rPr>
+              <w:t xml:space="preserve"> proyecto en conjunto con la carta Gantt.</w:t>
             </w:r>
           </w:p>
           <w:p>
@@ -1243,34 +942,25 @@
               <w:jc w:val="both"/>
               <w:rPr>
                 <w:rFonts w:ascii="Calibri" w:hAnsi="Calibri" w:cs="Arial"/>
-                <w:i/>
-                <w:color w:val="548DD4"/>
-                <w:sz w:val="20"/>
-                <w:szCs w:val="20"/>
-                <w:lang w:eastAsia="es-CL"/>
-              </w:rPr>
-            </w:pPr>
-            <w:r>
-              <w:rPr>
-                <w:rFonts w:ascii="Calibri" w:hAnsi="Calibri" w:cs="Arial"/>
-                <w:i/>
-                <w:color w:val="548DD4"/>
-                <w:sz w:val="20"/>
-                <w:szCs w:val="20"/>
-                <w:lang w:eastAsia="es-CL"/>
-              </w:rPr>
-              <w:t xml:space="preserve">En caso de ser pertinente </w:t>
-            </w:r>
-            <w:r>
-              <w:rPr>
-                <w:rFonts w:ascii="Calibri" w:hAnsi="Calibri" w:cs="Arial"/>
-                <w:i/>
-                <w:color w:val="548DD4"/>
-                <w:sz w:val="20"/>
-                <w:szCs w:val="20"/>
-                <w:lang w:eastAsia="es-CL"/>
-              </w:rPr>
-              <w:t>explica cómo resguardaste la calidad de tu Proyecto APT a partir de aspectos propios de tu disciplina (correcta aplicación de metodologías, actividades, herramientas, recursos propios, etc.).</w:t>
+                <w:b/>
+                <w:i/>
+                <w:color w:val="548DD4"/>
+                <w:sz w:val="20"/>
+                <w:szCs w:val="20"/>
+                <w:lang w:eastAsia="es-CL"/>
+              </w:rPr>
+            </w:pPr>
+            <w:r>
+              <w:rPr>
+                <w:rFonts w:ascii="Calibri" w:hAnsi="Calibri" w:cs="Arial"/>
+                <w:b/>
+                <w:i/>
+                <w:color w:val="548DD4"/>
+                <w:sz w:val="20"/>
+                <w:szCs w:val="20"/>
+                <w:lang w:eastAsia="es-CL"/>
+              </w:rPr>
+              <w:t>Dentro de las cosas que podría ser dentro de los siguientes días (todo esto fue escrito un 30 de septiembre de 2026) sería darle un formato mas agradable visualmente a la carta Gantt para que sea agradable revisarlo y no hacer vista entrecerrada para ver la letra por la calidad de la imagen.</w:t>
             </w:r>
           </w:p>
           <w:p>
@@ -1289,13 +979,71 @@
             <w:r>
               <w:rPr>
                 <w:rFonts w:ascii="Calibri" w:hAnsi="Calibri" w:cs="Arial"/>
-                <w:i/>
-                <w:color w:val="548DD4"/>
-                <w:sz w:val="20"/>
-                <w:szCs w:val="20"/>
-                <w:lang w:eastAsia="es-CL"/>
-              </w:rPr>
-              <w:t>En este apartado adjuntar la(s) evidencia(s) seleccionada(s) para ser evaluada por el docente.</w:t>
+                <w:b/>
+                <w:i/>
+                <w:color w:val="548DD4"/>
+                <w:sz w:val="20"/>
+                <w:szCs w:val="20"/>
+                <w:lang w:eastAsia="es-CL"/>
+              </w:rPr>
+              <w:object w:dxaOrig="1534" w:dyaOrig="997" w14:anchorId="38D43945">
+                <v:shapetype id="_x0000_t75" coordsize="21600,21600" o:spt="75" o:preferrelative="t" path="m@4@5l@4@11@9@11@9@5xe" filled="f" stroked="f">
+                  <v:stroke joinstyle="miter"/>
+                  <v:formulas>
+                    <v:f eqn="if lineDrawn pixelLineWidth 0"/>
+                    <v:f eqn="sum @0 1 0"/>
+                    <v:f eqn="sum 0 0 @1"/>
+                    <v:f eqn="prod @2 1 2"/>
+                    <v:f eqn="prod @3 21600 pixelWidth"/>
+                    <v:f eqn="prod @3 21600 pixelHeight"/>
+                    <v:f eqn="sum @0 0 1"/>
+                    <v:f eqn="prod @6 1 2"/>
+                    <v:f eqn="prod @7 21600 pixelWidth"/>
+                    <v:f eqn="sum @8 21600 0"/>
+                    <v:f eqn="prod @7 21600 pixelHeight"/>
+                    <v:f eqn="sum @10 21600 0"/>
+                  </v:formulas>
+                  <v:path o:extrusionok="f" gradientshapeok="t" o:connecttype="rect"/>
+                  <o:lock v:ext="edit" aspectratio="t"/>
+                </v:shapetype>
+                <v:shape id="_x0000_i1027" type="#_x0000_t75" style="width:82.3pt;height:53.15pt" o:ole="">
+                  <v:imagedata r:id="rId10" o:title=""/>
+                </v:shape>
+                <o:OLEObject Type="Link" ProgID="Acrobat.Document.DC" ShapeID="_x0000_i1027" DrawAspect="Icon" r:id="rId11" UpdateMode="Always">
+                  <o:LinkType>EnhancedMetaFile</o:LinkType>
+                  <o:LockedField>false</o:LockedField>
+                  <o:FieldCodes>\f 0</o:FieldCodes>
+                </o:OLEObject>
+              </w:object>
+            </w:r>
+            <w:r>
+              <w:rPr>
+                <w:rFonts w:ascii="Calibri" w:hAnsi="Calibri" w:cs="Arial"/>
+                <w:b/>
+                <w:i/>
+                <w:color w:val="548DD4"/>
+                <w:sz w:val="20"/>
+                <w:szCs w:val="20"/>
+                <w:lang w:eastAsia="es-CL"/>
+              </w:rPr>
+              <w:t xml:space="preserve">                                                    </w:t>
+            </w:r>
+            <w:r>
+              <w:rPr>
+                <w:rFonts w:ascii="Calibri" w:hAnsi="Calibri" w:cs="Arial"/>
+                <w:b/>
+                <w:i/>
+                <w:color w:val="548DD4"/>
+                <w:sz w:val="20"/>
+                <w:szCs w:val="20"/>
+                <w:lang w:eastAsia="es-CL"/>
+              </w:rPr>
+              <w:object w:dxaOrig="1534" w:dyaOrig="997" w14:anchorId="6042F440">
+                <v:shape id="_x0000_i1028" type="#_x0000_t75" style="width:78pt;height:51.45pt" o:ole="">
+                  <v:imagedata r:id="rId12" o:title=""/>
+                </v:shape>
+                <o:OLEObject Type="Embed" ProgID="Package" ShapeID="_x0000_i1028" DrawAspect="Icon" ObjectID="_1852290836" r:id="rId13"/>
+              </w:object>
             </w:r>
           </w:p>
         </w:tc>
@@ -2642,22 +2390,6 @@
           </w:p>
           <w:p>
             <w:pPr>
-              <w:rPr>
-                <w:rFonts w:ascii="Calibri" w:hAnsi="Calibri"/>
-                <w:color w:val="1F3864" w:themeColor="accent1" w:themeShade="80"/>
-              </w:rPr>
-            </w:pPr>
-          </w:p>
-          <w:p>
-            <w:pPr>
-              <w:rPr>
-                <w:rFonts w:ascii="Calibri" w:hAnsi="Calibri"/>
-                <w:color w:val="1F3864" w:themeColor="accent1" w:themeShade="80"/>
-              </w:rPr>
-            </w:pPr>
-          </w:p>
-          <w:p>
-            <w:pPr>
               <w:jc w:val="both"/>
               <w:rPr>
                 <w:rFonts w:ascii="Calibri" w:hAnsi="Calibri" w:cs="Arial"/>
@@ -2668,32 +2400,94 @@
                 <w:lang w:eastAsia="es-CL"/>
               </w:rPr>
             </w:pPr>
+            <w:r>
+              <w:rPr>
+                <w:rFonts w:ascii="Calibri" w:hAnsi="Calibri" w:cs="Arial"/>
+                <w:i/>
+                <w:color w:val="548DD4"/>
+                <w:lang w:eastAsia="es-CL"/>
+              </w:rPr>
+              <w:t xml:space="preserve">De los factores que han facilitado el desarrollo del proyecto ha sido el tener problemas que solucionar en mi vida, en la vida de las personas que quiero o de las comunidades de las que soy parte. También mi trabajo ha sido agilizado por la resolución de dudas de forma clara de la profesora a cargo de la asignatura de Capstone, quién me ha entregado algunas herramientas y ayuda que no recibí de otros profesores en semestres anteriores.  </w:t>
+            </w:r>
           </w:p>
           <w:p>
             <w:pPr>
               <w:jc w:val="both"/>
               <w:rPr>
                 <w:rFonts w:ascii="Calibri" w:hAnsi="Calibri" w:cs="Arial"/>
-                <w:i/>
-                <w:color w:val="548DD4"/>
-                <w:sz w:val="20"/>
-                <w:szCs w:val="20"/>
-                <w:lang w:eastAsia="es-CL"/>
-              </w:rPr>
-            </w:pPr>
-          </w:p>
-          <w:p>
-            <w:pPr>
-              <w:jc w:val="both"/>
-              <w:rPr>
-                <w:rFonts w:ascii="Calibri" w:hAnsi="Calibri" w:cs="Arial"/>
-                <w:i/>
-                <w:color w:val="548DD4"/>
-                <w:sz w:val="20"/>
-                <w:szCs w:val="20"/>
-                <w:lang w:eastAsia="es-CL"/>
-              </w:rPr>
-            </w:pPr>
+                <w:iCs/>
+                <w:color w:val="548DD4"/>
+                <w:sz w:val="20"/>
+                <w:szCs w:val="20"/>
+                <w:lang w:eastAsia="es-CL"/>
+              </w:rPr>
+            </w:pPr>
+            <w:r>
+              <w:rPr>
+                <w:rFonts w:ascii="Calibri" w:hAnsi="Calibri" w:cs="Arial"/>
+                <w:iCs/>
+                <w:color w:val="548DD4"/>
+                <w:sz w:val="20"/>
+                <w:szCs w:val="20"/>
+                <w:lang w:eastAsia="es-CL"/>
+              </w:rPr>
+              <w:t>Por el contrario</w:t>
+            </w:r>
+            <w:r>
+              <w:rPr>
+                <w:rFonts w:ascii="Calibri" w:hAnsi="Calibri" w:cs="Arial"/>
+                <w:iCs/>
+                <w:color w:val="548DD4"/>
+                <w:sz w:val="20"/>
+                <w:szCs w:val="20"/>
+                <w:lang w:eastAsia="es-CL"/>
+              </w:rPr>
+              <w:t>,</w:t>
+            </w:r>
+            <w:r>
+              <w:rPr>
+                <w:rFonts w:ascii="Calibri" w:hAnsi="Calibri" w:cs="Arial"/>
+                <w:iCs/>
+                <w:color w:val="548DD4"/>
+                <w:sz w:val="20"/>
+                <w:szCs w:val="20"/>
+                <w:lang w:eastAsia="es-CL"/>
+              </w:rPr>
+              <w:t xml:space="preserve"> al punto anterior, los factores que mas me han dificultado en el desarrollo de mi plan de trabajo es meramente situaciones mentales. </w:t>
+            </w:r>
+            <w:r>
+              <w:rPr>
+                <w:rFonts w:ascii="Calibri" w:hAnsi="Calibri" w:cs="Arial"/>
+                <w:iCs/>
+                <w:color w:val="548DD4"/>
+                <w:sz w:val="20"/>
+                <w:szCs w:val="20"/>
+                <w:lang w:eastAsia="es-CL"/>
+              </w:rPr>
+              <w:t>Sobre pensar</w:t>
+            </w:r>
+            <w:r>
+              <w:rPr>
+                <w:rFonts w:ascii="Calibri" w:hAnsi="Calibri" w:cs="Arial"/>
+                <w:iCs/>
+                <w:color w:val="548DD4"/>
+                <w:sz w:val="20"/>
+                <w:szCs w:val="20"/>
+                <w:lang w:eastAsia="es-CL"/>
+              </w:rPr>
+              <w:t xml:space="preserve"> alguna fase </w:t>
+            </w:r>
+            <w:r>
+              <w:rPr>
+                <w:rFonts w:ascii="Calibri" w:hAnsi="Calibri" w:cs="Arial"/>
+                <w:iCs/>
+                <w:color w:val="548DD4"/>
+                <w:sz w:val="20"/>
+                <w:szCs w:val="20"/>
+                <w:lang w:eastAsia="es-CL"/>
+              </w:rPr>
+              <w:t>donde podría tener una solución simple, pero al darle mas vueltas de las que debería, termino pensando en alguna que es el triple de complicada y que me deja al mismo nivel de las opciones que ya habían aparecido sin pensar en exceso.</w:t>
+            </w:r>
           </w:p>
         </w:tc>
       </w:tr>
@@ -2753,7 +2547,6 @@
                 <w:rFonts w:ascii="Calibri" w:hAnsi="Calibri"/>
                 <w:color w:val="1F3864" w:themeColor="accent1" w:themeShade="80"/>
               </w:rPr>
-              <w:lastRenderedPageBreak/>
               <w:t xml:space="preserve">Actividades ajustadas o eliminadas: </w:t>
             </w:r>
             <w:r>
@@ -3300,7 +3093,7 @@
       </w:pPr>
     </w:p>
     <w:sectPr>
-      <w:headerReference w:type="default" r:id="rId10"/>
+      <w:headerReference w:type="default" r:id="rId14"/>
       <w:pgSz w:w="11906" w:h="16838"/>
       <w:pgMar w:top="1417" w:right="1701" w:bottom="1417" w:left="1701" w:header="708" w:footer="708" w:gutter="0"/>
       <w:cols w:space="708"/>
@@ -3311,7 +3104,7 @@
 </file>
 
 <file path=word/endnotes.xml><?xml version="1.0" encoding="utf-8"?>
-<w:endnotes xmlns:wpc="http://schemas.microsoft.com/office/word/2010/wordprocessingCanvas" xmlns:cx="http://schemas.microsoft.com/office/drawing/2014/chartex" xmlns:mc="http://schemas.openxmlformats.org/markup-compatibility/2006" xmlns:o="urn:schemas-microsoft-com:office:office" xmlns:r="http://schemas.openxmlformats.org/officeDocument/2006/relationships" xmlns:m="http://schemas.openxmlformats.org/officeDocument/2006/math" xmlns:v="urn:schemas-microsoft-com:vml" xmlns:wp14="http://schemas.microsoft.com/office/word/2010/wordprocessingDrawing" xmlns:wp="http://schemas.openxmlformats.org/drawingml/2006/wordprocessingDrawing" xmlns:w10="urn:schemas-microsoft-com:office:word" xmlns:w="http://schemas.openxmlformats.org/wordprocessingml/2006/main" xmlns:w14="http://schemas.microsoft.com/office/word/2010/wordml" xmlns:w15="http://schemas.microsoft.com/office/word/2012/wordml" xmlns:w16se="http://schemas.microsoft.com/office/word/2015/wordml/symex" xmlns:wpg="http://schemas.microsoft.com/office/word/2010/wordprocessingGroup" xmlns:wpi="http://schemas.microsoft.com/office/word/2010/wordprocessingInk" xmlns:wne="http://schemas.microsoft.com/office/word/2006/wordml" xmlns:wps="http://schemas.microsoft.com/office/word/2010/wordprocessingShape" mc:Ignorable="w14 w15 w16se wp14">
+<w:endnotes xmlns:wpc="http://schemas.microsoft.com/office/word/2010/wordprocessingCanvas" xmlns:cx="http://schemas.microsoft.com/office/drawing/2014/chartex" xmlns:cx1="http://schemas.microsoft.com/office/drawing/2015/9/8/chartex" xmlns:cx2="http://schemas.microsoft.com/office/drawing/2015/10/21/chartex" xmlns:cx3="http://schemas.microsoft.com/office/drawing/2016/5/9/chartex" xmlns:cx4="http://schemas.microsoft.com/office/drawing/2016/5/10/chartex" xmlns:cx5="http://schemas.microsoft.com/office/drawing/2016/5/11/chartex" xmlns:cx6="http://schemas.microsoft.com/office/drawing/2016/5/12/chartex" xmlns:cx7="http://schemas.microsoft.com/office/drawing/2016/5/13/chartex" xmlns:cx8="http://schemas.microsoft.com/office/drawing/2016/5/14/chartex" xmlns:mc="http://schemas.openxmlformats.org/markup-compatibility/2006" xmlns:aink="http://schemas.microsoft.com/office/drawing/2016/ink" xmlns:am3d="http://schemas.microsoft.com/office/drawing/2017/model3d" xmlns:o="urn:schemas-microsoft-com:office:office" xmlns:r="http://schemas.openxmlformats.org/officeDocument/2006/relationships" xmlns:m="http://schemas.openxmlformats.org/officeDocument/2006/math" xmlns:v="urn:schemas-microsoft-com:vml" xmlns:wp14="http://schemas.microsoft.com/office/word/2010/wordprocessingDrawing" xmlns:wp="http://schemas.openxmlformats.org/drawingml/2006/wordprocessingDrawing" xmlns:w10="urn:schemas-microsoft-com:office:word" xmlns:w="http://schemas.openxmlformats.org/wordprocessingml/2006/main" xmlns:w14="http://schemas.microsoft.com/office/word/2010/wordml" xmlns:w15="http://schemas.microsoft.com/office/word/2012/wordml" xmlns:w16cex="http://schemas.microsoft.com/office/word/2018/wordml/cex" xmlns:w16cid="http://schemas.microsoft.com/office/word/2016/wordml/cid" xmlns:w16="http://schemas.microsoft.com/office/word/2018/wordml" xmlns:w16sdtdh="http://schemas.microsoft.com/office/word/2020/wordml/sdtdatahash" xmlns:w16se="http://schemas.microsoft.com/office/word/2015/wordml/symex" xmlns:wpg="http://schemas.microsoft.com/office/word/2010/wordprocessingGroup" xmlns:wpi="http://schemas.microsoft.com/office/word/2010/wordprocessingInk" xmlns:wne="http://schemas.microsoft.com/office/word/2006/wordml" xmlns:wps="http://schemas.microsoft.com/office/word/2010/wordprocessingShape" mc:Ignorable="w14 w15 w16se w16cid w16 w16cex w16sdtdh wp14">
   <w:endnote w:type="separator" w:id="-1">
     <w:p>
       <w:pPr>
@@ -3336,7 +3129,7 @@
 </file>
 
 <file path=word/footnotes.xml><?xml version="1.0" encoding="utf-8"?>
-<w:footnotes xmlns:wpc="http://schemas.microsoft.com/office/word/2010/wordprocessingCanvas" xmlns:cx="http://schemas.microsoft.com/office/drawing/2014/chartex" xmlns:mc="http://schemas.openxmlformats.org/markup-compatibility/2006" xmlns:o="urn:schemas-microsoft-com:office:office" xmlns:r="http://schemas.openxmlformats.org/officeDocument/2006/relationships" xmlns:m="http://schemas.openxmlformats.org/officeDocument/2006/math" xmlns:v="urn:schemas-microsoft-com:vml" xmlns:wp14="http://schemas.microsoft.com/office/word/2010/wordprocessingDrawing" xmlns:wp="http://schemas.openxmlformats.org/drawingml/2006/wordprocessingDrawing" xmlns:w10="urn:schemas-microsoft-com:office:word" xmlns:w="http://schemas.openxmlformats.org/wordprocessingml/2006/main" xmlns:w14="http://schemas.microsoft.com/office/word/2010/wordml" xmlns:w15="http://schemas.microsoft.com/office/word/2012/wordml" xmlns:w16se="http://schemas.microsoft.com/office/word/2015/wordml/symex" xmlns:wpg="http://schemas.microsoft.com/office/word/2010/wordprocessingGroup" xmlns:wpi="http://schemas.microsoft.com/office/word/2010/wordprocessingInk" xmlns:wne="http://schemas.microsoft.com/office/word/2006/wordml" xmlns:wps="http://schemas.microsoft.com/office/word/2010/wordprocessingShape" mc:Ignorable="w14 w15 w16se wp14">
+<w:footnotes xmlns:wpc="http://schemas.microsoft.com/office/word/2010/wordprocessingCanvas" xmlns:cx="http://schemas.microsoft.com/office/drawing/2014/chartex" xmlns:cx1="http://schemas.microsoft.com/office/drawing/2015/9/8/chartex" xmlns:cx2="http://schemas.microsoft.com/office/drawing/2015/10/21/chartex" xmlns:cx3="http://schemas.microsoft.com/office/drawing/2016/5/9/chartex" xmlns:cx4="http://schemas.microsoft.com/office/drawing/2016/5/10/chartex" xmlns:cx5="http://schemas.microsoft.com/office/drawing/2016/5/11/chartex" xmlns:cx6="http://schemas.microsoft.com/office/drawing/2016/5/12/chartex" xmlns:cx7="http://schemas.microsoft.com/office/drawing/2016/5/13/chartex" xmlns:cx8="http://schemas.microsoft.com/office/drawing/2016/5/14/chartex" xmlns:mc="http://schemas.openxmlformats.org/markup-compatibility/2006" xmlns:aink="http://schemas.microsoft.com/office/drawing/2016/ink" xmlns:am3d="http://schemas.microsoft.com/office/drawing/2017/model3d" xmlns:o="urn:schemas-microsoft-com:office:office" xmlns:r="http://schemas.openxmlformats.org/officeDocument/2006/relationships" xmlns:m="http://schemas.openxmlformats.org/officeDocument/2006/math" xmlns:v="urn:schemas-microsoft-com:vml" xmlns:wp14="http://schemas.microsoft.com/office/word/2010/wordprocessingDrawing" xmlns:wp="http://schemas.openxmlformats.org/drawingml/2006/wordprocessingDrawing" xmlns:w10="urn:schemas-microsoft-com:office:word" xmlns:w="http://schemas.openxmlformats.org/wordprocessingml/2006/main" xmlns:w14="http://schemas.microsoft.com/office/word/2010/wordml" xmlns:w15="http://schemas.microsoft.com/office/word/2012/wordml" xmlns:w16cex="http://schemas.microsoft.com/office/word/2018/wordml/cex" xmlns:w16cid="http://schemas.microsoft.com/office/word/2016/wordml/cid" xmlns:w16="http://schemas.microsoft.com/office/word/2018/wordml" xmlns:w16sdtdh="http://schemas.microsoft.com/office/word/2020/wordml/sdtdatahash" xmlns:w16se="http://schemas.microsoft.com/office/word/2015/wordml/symex" xmlns:wpg="http://schemas.microsoft.com/office/word/2010/wordprocessingGroup" xmlns:wpi="http://schemas.microsoft.com/office/word/2010/wordprocessingInk" xmlns:wne="http://schemas.microsoft.com/office/word/2006/wordml" xmlns:wps="http://schemas.microsoft.com/office/word/2010/wordprocessingShape" mc:Ignorable="w14 w15 w16se w16cid w16 w16cex w16sdtdh wp14">
   <w:footnote w:type="separator" w:id="-1">
     <w:p>
       <w:pPr>
@@ -3419,7 +3212,7 @@
 </file>
 
 <file path=word/header1.xml><?xml version="1.0" encoding="utf-8"?>
-<w:hdr xmlns:wpc="http://schemas.microsoft.com/office/word/2010/wordprocessingCanvas" xmlns:cx="http://schemas.microsoft.com/office/drawing/2014/chartex" xmlns:mc="http://schemas.openxmlformats.org/markup-compatibility/2006" xmlns:o="urn:schemas-microsoft-com:office:office" xmlns:r="http://schemas.openxmlformats.org/officeDocument/2006/relationships" xmlns:m="http://schemas.openxmlformats.org/officeDocument/2006/math" xmlns:v="urn:schemas-microsoft-com:vml" xmlns:wp14="http://schemas.microsoft.com/office/word/2010/wordprocessingDrawing" xmlns:wp="http://schemas.openxmlformats.org/drawingml/2006/wordprocessingDrawing" xmlns:w10="urn:schemas-microsoft-com:office:word" xmlns:w="http://schemas.openxmlformats.org/wordprocessingml/2006/main" xmlns:w14="http://schemas.microsoft.com/office/word/2010/wordml" xmlns:w15="http://schemas.microsoft.com/office/word/2012/wordml" xmlns:w16se="http://schemas.microsoft.com/office/word/2015/wordml/symex" xmlns:wpg="http://schemas.microsoft.com/office/word/2010/wordprocessingGroup" xmlns:wpi="http://schemas.microsoft.com/office/word/2010/wordprocessingInk" xmlns:wne="http://schemas.microsoft.com/office/word/2006/wordml" xmlns:wps="http://schemas.microsoft.com/office/word/2010/wordprocessingShape" mc:Ignorable="w14 w15 w16se wp14">
+<w:hdr xmlns:wpc="http://schemas.microsoft.com/office/word/2010/wordprocessingCanvas" xmlns:cx="http://schemas.microsoft.com/office/drawing/2014/chartex" xmlns:cx1="http://schemas.microsoft.com/office/drawing/2015/9/8/chartex" xmlns:cx2="http://schemas.microsoft.com/office/drawing/2015/10/21/chartex" xmlns:cx3="http://schemas.microsoft.com/office/drawing/2016/5/9/chartex" xmlns:cx4="http://schemas.microsoft.com/office/drawing/2016/5/10/chartex" xmlns:cx5="http://schemas.microsoft.com/office/drawing/2016/5/11/chartex" xmlns:cx6="http://schemas.microsoft.com/office/drawing/2016/5/12/chartex" xmlns:cx7="http://schemas.microsoft.com/office/drawing/2016/5/13/chartex" xmlns:cx8="http://schemas.microsoft.com/office/drawing/2016/5/14/chartex" xmlns:mc="http://schemas.openxmlformats.org/markup-compatibility/2006" xmlns:aink="http://schemas.microsoft.com/office/drawing/2016/ink" xmlns:am3d="http://schemas.microsoft.com/office/drawing/2017/model3d" xmlns:o="urn:schemas-microsoft-com:office:office" xmlns:r="http://schemas.openxmlformats.org/officeDocument/2006/relationships" xmlns:m="http://schemas.openxmlformats.org/officeDocument/2006/math" xmlns:v="urn:schemas-microsoft-com:vml" xmlns:wp14="http://schemas.microsoft.com/office/word/2010/wordprocessingDrawing" xmlns:wp="http://schemas.openxmlformats.org/drawingml/2006/wordprocessingDrawing" xmlns:w10="urn:schemas-microsoft-com:office:word" xmlns:w="http://schemas.openxmlformats.org/wordprocessingml/2006/main" xmlns:w14="http://schemas.microsoft.com/office/word/2010/wordml" xmlns:w15="http://schemas.microsoft.com/office/word/2012/wordml" xmlns:w16cex="http://schemas.microsoft.com/office/word/2018/wordml/cex" xmlns:w16cid="http://schemas.microsoft.com/office/word/2016/wordml/cid" xmlns:w16="http://schemas.microsoft.com/office/word/2018/wordml" xmlns:w16sdtdh="http://schemas.microsoft.com/office/word/2020/wordml/sdtdatahash" xmlns:w16se="http://schemas.microsoft.com/office/word/2015/wordml/symex" xmlns:wpg="http://schemas.microsoft.com/office/word/2010/wordprocessingGroup" xmlns:wpi="http://schemas.microsoft.com/office/word/2010/wordprocessingInk" xmlns:wne="http://schemas.microsoft.com/office/word/2006/wordml" xmlns:wps="http://schemas.microsoft.com/office/word/2010/wordprocessingShape" mc:Ignorable="w14 w15 w16se w16cid w16 w16cex w16sdtdh wp14">
   <w:tbl>
     <w:tblPr>
       <w:tblStyle w:val="Tablaconcuadrcula1"/>
@@ -3644,7 +3437,7 @@
 </file>
 
 <file path=word/numbering.xml><?xml version="1.0" encoding="utf-8"?>
-<w:numbering xmlns:wpc="http://schemas.microsoft.com/office/word/2010/wordprocessingCanvas" xmlns:cx="http://schemas.microsoft.com/office/drawing/2014/chartex" xmlns:mc="http://schemas.openxmlformats.org/markup-compatibility/2006" xmlns:o="urn:schemas-microsoft-com:office:office" xmlns:r="http://schemas.openxmlformats.org/officeDocument/2006/relationships" xmlns:m="http://schemas.openxmlformats.org/officeDocument/2006/math" xmlns:v="urn:schemas-microsoft-com:vml" xmlns:wp14="http://schemas.microsoft.com/office/word/2010/wordprocessingDrawing" xmlns:wp="http://schemas.openxmlformats.org/drawingml/2006/wordprocessingDrawing" xmlns:w10="urn:schemas-microsoft-com:office:word" xmlns:w="http://schemas.openxmlformats.org/wordprocessingml/2006/main" xmlns:w14="http://schemas.microsoft.com/office/word/2010/wordml" xmlns:w15="http://schemas.microsoft.com/office/word/2012/wordml" xmlns:w16se="http://schemas.microsoft.com/office/word/2015/wordml/symex" xmlns:wpg="http://schemas.microsoft.com/office/word/2010/wordprocessingGroup" xmlns:wpi="http://schemas.microsoft.com/office/word/2010/wordprocessingInk" xmlns:wne="http://schemas.microsoft.com/office/word/2006/wordml" xmlns:wps="http://schemas.microsoft.com/office/word/2010/wordprocessingShape" mc:Ignorable="w14 w15 w16se wp14">
+<w:numbering xmlns:wpc="http://schemas.microsoft.com/office/word/2010/wordprocessingCanvas" xmlns:cx="http://schemas.microsoft.com/office/drawing/2014/chartex" xmlns:cx1="http://schemas.microsoft.com/office/drawing/2015/9/8/chartex" xmlns:cx2="http://schemas.microsoft.com/office/drawing/2015/10/21/chartex" xmlns:cx3="http://schemas.microsoft.com/office/drawing/2016/5/9/chartex" xmlns:cx4="http://schemas.microsoft.com/office/drawing/2016/5/10/chartex" xmlns:cx5="http://schemas.microsoft.com/office/drawing/2016/5/11/chartex" xmlns:cx6="http://schemas.microsoft.com/office/drawing/2016/5/12/chartex" xmlns:cx7="http://schemas.microsoft.com/office/drawing/2016/5/13/chartex" xmlns:cx8="http://schemas.microsoft.com/office/drawing/2016/5/14/chartex" xmlns:mc="http://schemas.openxmlformats.org/markup-compatibility/2006" xmlns:aink="http://schemas.microsoft.com/office/drawing/2016/ink" xmlns:am3d="http://schemas.microsoft.com/office/drawing/2017/model3d" xmlns:o="urn:schemas-microsoft-com:office:office" xmlns:r="http://schemas.openxmlformats.org/officeDocument/2006/relationships" xmlns:m="http://schemas.openxmlformats.org/officeDocument/2006/math" xmlns:v="urn:schemas-microsoft-com:vml" xmlns:wp14="http://schemas.microsoft.com/office/word/2010/wordprocessingDrawing" xmlns:wp="http://schemas.openxmlformats.org/drawingml/2006/wordprocessingDrawing" xmlns:w10="urn:schemas-microsoft-com:office:word" xmlns:w="http://schemas.openxmlformats.org/wordprocessingml/2006/main" xmlns:w14="http://schemas.microsoft.com/office/word/2010/wordml" xmlns:w15="http://schemas.microsoft.com/office/word/2012/wordml" xmlns:w16cex="http://schemas.microsoft.com/office/word/2018/wordml/cex" xmlns:w16cid="http://schemas.microsoft.com/office/word/2016/wordml/cid" xmlns:w16="http://schemas.microsoft.com/office/word/2018/wordml" xmlns:w16sdtdh="http://schemas.microsoft.com/office/word/2020/wordml/sdtdatahash" xmlns:w16se="http://schemas.microsoft.com/office/word/2015/wordml/symex" xmlns:wpg="http://schemas.microsoft.com/office/word/2010/wordprocessingGroup" xmlns:wpi="http://schemas.microsoft.com/office/word/2010/wordprocessingInk" xmlns:wne="http://schemas.microsoft.com/office/word/2006/wordml" xmlns:wps="http://schemas.microsoft.com/office/word/2010/wordprocessingShape" mc:Ignorable="w14 w15 w16se w16cid w16 w16cex w16sdtdh wp14">
   <w:abstractNum w:abstractNumId="0" w15:restartNumberingAfterBreak="0">
     <w:nsid w:val="2FFD4C7F"/>
     <w:multiLevelType w:val="multilevel"/>
@@ -3773,7 +3566,7 @@
 </file>
 
 <file path=word/styles.xml><?xml version="1.0" encoding="utf-8"?>
-<w:styles xmlns:mc="http://schemas.openxmlformats.org/markup-compatibility/2006" xmlns:r="http://schemas.openxmlformats.org/officeDocument/2006/relationships" xmlns:w="http://schemas.openxmlformats.org/wordprocessingml/2006/main" xmlns:w14="http://schemas.microsoft.com/office/word/2010/wordml" xmlns:w15="http://schemas.microsoft.com/office/word/2012/wordml" xmlns:w16se="http://schemas.microsoft.com/office/word/2015/wordml/symex" mc:Ignorable="w14 w15 w16se">
+<w:styles xmlns:mc="http://schemas.openxmlformats.org/markup-compatibility/2006" xmlns:r="http://schemas.openxmlformats.org/officeDocument/2006/relationships" xmlns:w="http://schemas.openxmlformats.org/wordprocessingml/2006/main" xmlns:w14="http://schemas.microsoft.com/office/word/2010/wordml" xmlns:w15="http://schemas.microsoft.com/office/word/2012/wordml" xmlns:w16cex="http://schemas.microsoft.com/office/word/2018/wordml/cex" xmlns:w16cid="http://schemas.microsoft.com/office/word/2016/wordml/cid" xmlns:w16="http://schemas.microsoft.com/office/word/2018/wordml" xmlns:w16sdtdh="http://schemas.microsoft.com/office/word/2020/wordml/sdtdatahash" xmlns:w16se="http://schemas.microsoft.com/office/word/2015/wordml/symex" mc:Ignorable="w14 w15 w16se w16cid w16 w16cex w16sdtdh">
   <w:docDefaults>
     <w:rPrDefault>
       <w:rPr>
@@ -3785,7 +3578,7 @@
     </w:rPrDefault>
     <w:pPrDefault/>
   </w:docDefaults>
-  <w:latentStyles w:defLockedState="0" w:defUIPriority="99" w:defSemiHidden="0" w:defUnhideWhenUsed="0" w:defQFormat="0" w:count="371">
+  <w:latentStyles w:defLockedState="0" w:defUIPriority="99" w:defSemiHidden="0" w:defUnhideWhenUsed="0" w:defQFormat="0" w:count="376">
     <w:lsdException w:name="Normal" w:uiPriority="0" w:qFormat="1"/>
     <w:lsdException w:name="heading 1" w:uiPriority="9" w:qFormat="1"/>
     <w:lsdException w:name="heading 2" w:semiHidden="1" w:uiPriority="9" w:unhideWhenUsed="1" w:qFormat="1"/>
@@ -3891,7 +3684,6 @@
     <w:lsdException w:name="HTML Sample" w:semiHidden="1" w:unhideWhenUsed="1"/>
     <w:lsdException w:name="HTML Typewriter" w:semiHidden="1" w:unhideWhenUsed="1"/>
     <w:lsdException w:name="HTML Variable" w:semiHidden="1" w:unhideWhenUsed="1"/>
-    <w:lsdException w:name="Normal Table" w:semiHidden="1" w:unhideWhenUsed="1"/>
     <w:lsdException w:name="annotation subject" w:semiHidden="1" w:unhideWhenUsed="1"/>
     <w:lsdException w:name="No List" w:semiHidden="1" w:unhideWhenUsed="1"/>
     <w:lsdException w:name="Outline List 1" w:semiHidden="1" w:unhideWhenUsed="1"/>
@@ -3934,11 +3726,8 @@
     <w:lsdException w:name="Table Contemporary" w:semiHidden="1" w:unhideWhenUsed="1"/>
     <w:lsdException w:name="Table Elegant" w:semiHidden="1" w:unhideWhenUsed="1"/>
     <w:lsdException w:name="Table Professional" w:semiHidden="1" w:unhideWhenUsed="1"/>
-    <w:lsdException w:name="Table Subtle 1" w:semiHidden="1" w:unhideWhenUsed="1"/>
     <w:lsdException w:name="Table Subtle 2" w:semiHidden="1" w:unhideWhenUsed="1"/>
     <w:lsdException w:name="Table Web 1" w:semiHidden="1" w:unhideWhenUsed="1"/>
-    <w:lsdException w:name="Table Web 2" w:semiHidden="1" w:unhideWhenUsed="1"/>
-    <w:lsdException w:name="Table Web 3" w:semiHidden="1" w:unhideWhenUsed="1"/>
     <w:lsdException w:name="Balloon Text" w:semiHidden="1" w:unhideWhenUsed="1"/>
     <w:lsdException w:name="Table Grid" w:uiPriority="39"/>
     <w:lsdException w:name="Table Theme" w:semiHidden="1" w:unhideWhenUsed="1"/>
@@ -4157,6 +3946,11 @@
     <w:lsdException w:name="List Table 5 Dark Accent 6" w:uiPriority="50"/>
     <w:lsdException w:name="List Table 6 Colorful Accent 6" w:uiPriority="51"/>
     <w:lsdException w:name="List Table 7 Colorful Accent 6" w:uiPriority="52"/>
+    <w:lsdException w:name="Mention" w:semiHidden="1" w:unhideWhenUsed="1"/>
+    <w:lsdException w:name="Smart Hyperlink" w:semiHidden="1" w:unhideWhenUsed="1"/>
+    <w:lsdException w:name="Hashtag" w:semiHidden="1" w:unhideWhenUsed="1"/>
+    <w:lsdException w:name="Unresolved Mention" w:semiHidden="1" w:unhideWhenUsed="1"/>
+    <w:lsdException w:name="Smart Link" w:semiHidden="1" w:unhideWhenUsed="1"/>
   </w:latentStyles>
   <w:style w:type="paragraph" w:default="1" w:styleId="Normal">
     <w:name w:val="Normal"/>
@@ -4759,9 +4553,12 @@
 </file>
 
 <file path=customXml/item1.xml><?xml version="1.0" encoding="utf-8"?>
-<p:properties xmlns:p="http://schemas.microsoft.com/office/2006/metadata/properties" xmlns:xsi="http://www.w3.org/2001/XMLSchema-instance" xmlns:pc="http://schemas.microsoft.com/office/infopath/2007/PartnerControls">
-  <documentManagement/>
-</p:properties>
+<?mso-contentType ?>
+<FormTemplates xmlns="http://schemas.microsoft.com/sharepoint/v3/contenttype/forms">
+  <Display>DocumentLibraryForm</Display>
+  <Edit>DocumentLibraryForm</Edit>
+  <New>DocumentLibraryForm</New>
+</FormTemplates>
 </file>
 
 <file path=customXml/item2.xml><?xml version="1.0" encoding="utf-8"?>
@@ -4897,26 +4694,15 @@
 </file>
 
 <file path=customXml/item3.xml><?xml version="1.0" encoding="utf-8"?>
-<?mso-contentType ?>
-<FormTemplates xmlns="http://schemas.microsoft.com/sharepoint/v3/contenttype/forms">
-  <Display>DocumentLibraryForm</Display>
-  <Edit>DocumentLibraryForm</Edit>
-  <New>DocumentLibraryForm</New>
-</FormTemplates>
+<p:properties xmlns:p="http://schemas.microsoft.com/office/2006/metadata/properties" xmlns:xsi="http://www.w3.org/2001/XMLSchema-instance" xmlns:pc="http://schemas.microsoft.com/office/infopath/2007/PartnerControls">
+  <documentManagement/>
+</p:properties>
 </file>
 
 <file path=customXml/itemProps1.xml><?xml version="1.0" encoding="utf-8"?>
-<ds:datastoreItem xmlns:ds="http://schemas.openxmlformats.org/officeDocument/2006/customXml" ds:itemID="{46CA5683-AF87-4E40-B841-2E23A3B52406}">
+<ds:datastoreItem xmlns:ds="http://schemas.openxmlformats.org/officeDocument/2006/customXml" ds:itemID="{D51C61E4-DB75-4684-AD25-71F546404E96}">
   <ds:schemaRefs>
-    <ds:schemaRef ds:uri="http://purl.org/dc/terms/"/>
-    <ds:schemaRef ds:uri="http://purl.org/dc/elements/1.1/"/>
-    <ds:schemaRef ds:uri="http://schemas.openxmlformats.org/package/2006/metadata/core-properties"/>
-    <ds:schemaRef ds:uri="http://www.w3.org/XML/1998/namespace"/>
-    <ds:schemaRef ds:uri="http://schemas.microsoft.com/office/2006/metadata/properties"/>
-    <ds:schemaRef ds:uri="http://schemas.microsoft.com/office/2006/documentManagement/types"/>
-    <ds:schemaRef ds:uri="http://purl.org/dc/dcmitype/"/>
-    <ds:schemaRef ds:uri="http://schemas.microsoft.com/office/infopath/2007/PartnerControls"/>
-    <ds:schemaRef ds:uri="126e8a1c-9ea9-435a-ac89-d06c80d62e30"/>
+    <ds:schemaRef ds:uri="http://schemas.microsoft.com/sharepoint/v3/contenttype/forms"/>
   </ds:schemaRefs>
 </ds:datastoreItem>
 </file>
@@ -4940,9 +4726,10 @@
 </file>
 
 <file path=customXml/itemProps3.xml><?xml version="1.0" encoding="utf-8"?>
-<ds:datastoreItem xmlns:ds="http://schemas.openxmlformats.org/officeDocument/2006/customXml" ds:itemID="{D51C61E4-DB75-4684-AD25-71F546404E96}">
+<ds:datastoreItem xmlns:ds="http://schemas.openxmlformats.org/officeDocument/2006/customXml" ds:itemID="{46CA5683-AF87-4E40-B841-2E23A3B52406}">
   <ds:schemaRefs>
-    <ds:schemaRef ds:uri="http://schemas.microsoft.com/sharepoint/v3/contenttype/forms"/>
+    <ds:schemaRef ds:uri="http://schemas.microsoft.com/office/2006/metadata/properties"/>
+    <ds:schemaRef ds:uri="http://schemas.microsoft.com/office/infopath/2007/PartnerControls"/>
   </ds:schemaRefs>
 </ds:datastoreItem>
 </file>
</xml_diff>